<commit_message>
Livro: o carrinho de cachorro-quente entra, e muda a espinha de As sete quedas
A quinta queda contada e a primeira na vida dele: apos o desligamento da
Fiat, um ano sem emprego por causa do "vai sujar sua carteira", o carrinho
comprado fiado com tres meses de carencia pagando 25% a mais pelo prazo, o
molho feito novo todo dia e o pao pago no dia seguinte, o ponto nos
predinhos do Floramar onde morava a Erica, e o pedido de devolucao cinco
dias antes da primeira parcela.

Ela e a da academia tem a mesma moral com vinte anos de distancia, entao
ficaram nas duas pontas do capitulo. A frase que amarra: combinado que nao
esta escrito nao existe, e contrato que voce nao leu e um combinado de boca
com mais paginas.

Capitulo passou de 7 para 10 paginas. Parcial: 60 das 100.

Novo na memoria: ele trabalhou na Fiat Automoveis, o que nao estava
registrado em lugar nenhum.

Co-Authored-By: Claude Opus 5 <noreply@anthropic.com>
</commit_message>
<xml_diff>
--- a/livro-o-medico-e-o-executivo/formatado/as-sete-quedas.docx
+++ b/livro-o-medico-e-o-executivo/formatado/as-sete-quedas.docx
@@ -82,7 +82,526 @@
           <w:b/>
           <w:i w:val="0"/>
         </w:rPr>
-        <w:t>A primeira: o chão que não era meu</w:t>
+        <w:t>O carrinho: a primeira, e a que mais doeu</w:t>
+      </w:r>
+    </w:p>
+    <w:p>
+      <w:pPr>
+        <w:spacing w:line="360" w:lineRule="auto" w:after="0"/>
+        <w:ind w:firstLine="709"/>
+        <w:jc w:val="both"/>
+      </w:pPr>
+      <w:r>
+        <w:t>Eu começo por esta porque foi a primeira vez que eu perdi um negócio, e porque, de todas as sete, foi a que me machucou mais. As outras me custaram dinheiro. Esta me custou um projeto de vida.</w:t>
+      </w:r>
+    </w:p>
+    <w:p>
+      <w:pPr>
+        <w:spacing w:line="360" w:lineRule="auto" w:before="360" w:after="120"/>
+      </w:pPr>
+      <w:r>
+        <w:rPr>
+          <w:b/>
+          <w:i/>
+        </w:rPr>
+        <w:t>Um ano sem conseguir emprego</w:t>
+      </w:r>
+    </w:p>
+    <w:p>
+      <w:pPr>
+        <w:spacing w:line="360" w:lineRule="auto" w:after="0"/>
+        <w:ind w:firstLine="709"/>
+        <w:jc w:val="both"/>
+      </w:pPr>
+      <w:r>
+        <w:t>Nos anos noventa eu fui desligado da Fiat Automóveis, e aí descobri uma coisa sobre o mercado de trabalho brasileiro que ninguém conta.</w:t>
+      </w:r>
+    </w:p>
+    <w:p>
+      <w:pPr>
+        <w:spacing w:line="360" w:lineRule="auto" w:after="0"/>
+        <w:ind w:firstLine="709"/>
+        <w:jc w:val="both"/>
+      </w:pPr>
+      <w:r>
+        <w:t xml:space="preserve">Eu não conseguia emprego. Não por falta de vaga, não por falta de qualificação. Em toda entrevista aparecia a mesma frase, dita quase como desculpa: </w:t>
+      </w:r>
+      <w:r>
+        <w:rPr>
+          <w:b/>
+        </w:rPr>
+        <w:t>"vai sujar a sua carteira".</w:t>
+      </w:r>
+    </w:p>
+    <w:p>
+      <w:pPr>
+        <w:spacing w:line="360" w:lineRule="auto" w:after="0"/>
+        <w:ind w:firstLine="709"/>
+        <w:jc w:val="both"/>
+      </w:pPr>
+      <w:r>
+        <w:t>Era o termo que as empresas usavam na hora de registrar alguém. Levei anos para entender a lógica por trás daquele fantasma, e quando entendi vi que não era preconceito, era medo com endereço. Naquela época, sem a regulação clara que veio depois, a empresa que registrasse um funcionário por um salário menor do que o último anotado na carteira dele corria risco real de, numa ação trabalhista, ser obrigada a equiparar ao salário anterior. Isso quebrou muita empresa pequena.</w:t>
+      </w:r>
+    </w:p>
+    <w:p>
+      <w:pPr>
+        <w:spacing w:line="360" w:lineRule="auto" w:after="0"/>
+        <w:ind w:firstLine="709"/>
+        <w:jc w:val="both"/>
+      </w:pPr>
+      <w:r>
+        <w:t xml:space="preserve">Resultado prático: </w:t>
+      </w:r>
+      <w:r>
+        <w:rPr>
+          <w:b/>
+        </w:rPr>
+        <w:t>quem vinha de multinacional ficava inempregável para baixo.</w:t>
+      </w:r>
+      <w:r>
+        <w:t xml:space="preserve"> Eu tinha carteira de multinacional e não tinha emprego.</w:t>
+      </w:r>
+    </w:p>
+    <w:p>
+      <w:pPr>
+        <w:spacing w:line="360" w:lineRule="auto" w:after="0"/>
+        <w:ind w:firstLine="709"/>
+        <w:jc w:val="both"/>
+      </w:pPr>
+      <w:r>
+        <w:t>Passei um ano assim, fazendo bico de soldador e de serviços gerais. Quem nunca passou um ano procurando trabalho sem achar não sabe o que aquilo faz com a cabeça de um homem jovem.</w:t>
+      </w:r>
+    </w:p>
+    <w:p>
+      <w:pPr>
+        <w:spacing w:line="360" w:lineRule="auto" w:before="360" w:after="120"/>
+      </w:pPr>
+      <w:r>
+        <w:rPr>
+          <w:b/>
+          <w:i/>
+        </w:rPr>
+        <w:t>A proposta que eu inventei sem saber o nome dela</w:t>
+      </w:r>
+    </w:p>
+    <w:p>
+      <w:pPr>
+        <w:spacing w:line="360" w:lineRule="auto" w:after="0"/>
+        <w:ind w:firstLine="709"/>
+        <w:jc w:val="both"/>
+      </w:pPr>
+      <w:r>
+        <w:t>Um amigo do bairro tinha um carrinho de cachorro-quente e estava trocando o velho por um mais novo. Ele ia vender o antigo.</w:t>
+      </w:r>
+    </w:p>
+    <w:p>
+      <w:pPr>
+        <w:spacing w:line="360" w:lineRule="auto" w:after="0"/>
+        <w:ind w:firstLine="709"/>
+        <w:jc w:val="both"/>
+      </w:pPr>
+      <w:r>
+        <w:t>Eu não tinha um real. E fiz a única proposta que me ocorreu:</w:t>
+      </w:r>
+    </w:p>
+    <w:p>
+      <w:pPr>
+        <w:spacing w:line="360" w:lineRule="auto" w:after="0"/>
+        <w:ind w:firstLine="709"/>
+        <w:jc w:val="both"/>
+      </w:pPr>
+      <w:r>
+        <w:rPr>
+          <w:b/>
+        </w:rPr>
+        <w:t>Me vende o carrinho fiado, mas eu preciso de três meses de carência para começar a pagar.</w:t>
+      </w:r>
+    </w:p>
+    <w:p>
+      <w:pPr>
+        <w:spacing w:line="360" w:lineRule="auto" w:after="0"/>
+        <w:ind w:firstLine="709"/>
+        <w:jc w:val="both"/>
+      </w:pPr>
+      <w:r>
+        <w:t xml:space="preserve">O carrinho valia uns quatro mil reais. Eu ofereci </w:t>
+      </w:r>
+      <w:r>
+        <w:rPr>
+          <w:b/>
+        </w:rPr>
+        <w:t>dez parcelas de quinhentos</w:t>
+      </w:r>
+      <w:r>
+        <w:t>, ou seja, cinco mil. Paguei mil reais a mais pelo prazo, de boa vontade, porque sem o prazo eu não tinha negócio nenhum.</w:t>
+      </w:r>
+    </w:p>
+    <w:p>
+      <w:pPr>
+        <w:spacing w:line="360" w:lineRule="auto" w:after="0"/>
+        <w:ind w:firstLine="709"/>
+        <w:jc w:val="both"/>
+      </w:pPr>
+      <w:r>
+        <w:t>Hoje eu sei o nome do que eu fiz ali: eu comprei capital de giro. Paguei vinte e cinco por cento a mais por noventa dias de fôlego, que é mais ou menos o que custa dinheiro para quem não tem garantia nenhuma. Na época eu só achei que tinha sido esperto.</w:t>
+      </w:r>
+    </w:p>
+    <w:p>
+      <w:pPr>
+        <w:spacing w:line="360" w:lineRule="auto" w:after="0"/>
+        <w:ind w:firstLine="709"/>
+        <w:jc w:val="both"/>
+      </w:pPr>
+      <w:r>
+        <w:rPr>
+          <w:b/>
+        </w:rPr>
+        <w:t>A gente fechou de boca.</w:t>
+      </w:r>
+      <w:r>
+        <w:t xml:space="preserve"> Guarde essa frase.</w:t>
+      </w:r>
+    </w:p>
+    <w:p>
+      <w:pPr>
+        <w:spacing w:line="360" w:lineRule="auto" w:before="360" w:after="120"/>
+      </w:pPr>
+      <w:r>
+        <w:rPr>
+          <w:b/>
+          <w:i/>
+        </w:rPr>
+        <w:t>Os três meses em que eu aprendi gestão</w:t>
+      </w:r>
+    </w:p>
+    <w:p>
+      <w:pPr>
+        <w:spacing w:line="360" w:lineRule="auto" w:after="0"/>
+        <w:ind w:firstLine="709"/>
+        <w:jc w:val="both"/>
+      </w:pPr>
+      <w:r>
+        <w:t>Eu não tinha ponto. Então eu empurrava o carrinho até onde tivesse gente, inclusive até o campo de futebol do bairro.</w:t>
+      </w:r>
+    </w:p>
+    <w:p>
+      <w:pPr>
+        <w:spacing w:line="360" w:lineRule="auto" w:after="0"/>
+        <w:ind w:firstLine="709"/>
+        <w:jc w:val="both"/>
+      </w:pPr>
+      <w:r>
+        <w:t xml:space="preserve">E aí veio a sacada que, olhando de hoje, foi a coisa mais importante que eu fiz naquele negócio. </w:t>
+      </w:r>
+      <w:r>
+        <w:rPr>
+          <w:b/>
+        </w:rPr>
+        <w:t>Eu fazia o molho e a maionese novos todos os dias.</w:t>
+      </w:r>
+      <w:r>
+        <w:t xml:space="preserve"> E o pão eu comprava na padaria toda manhã, acertando com o padeiro para pagar no dia seguinte.</w:t>
+      </w:r>
+    </w:p>
+    <w:p>
+      <w:pPr>
+        <w:spacing w:line="360" w:lineRule="auto" w:after="0"/>
+        <w:ind w:firstLine="709"/>
+        <w:jc w:val="both"/>
+      </w:pPr>
+      <w:r>
+        <w:t>Parecia só caprichoso. Era três coisas ao mesmo tempo.</w:t>
+      </w:r>
+    </w:p>
+    <w:p>
+      <w:pPr>
+        <w:spacing w:line="360" w:lineRule="auto" w:after="0"/>
+        <w:ind w:firstLine="709"/>
+        <w:jc w:val="both"/>
+      </w:pPr>
+      <w:r>
+        <w:t xml:space="preserve">Era </w:t>
+      </w:r>
+      <w:r>
+        <w:rPr>
+          <w:b/>
+        </w:rPr>
+        <w:t>qualidade</w:t>
+      </w:r>
+      <w:r>
+        <w:t>: ninguém come maionese de ontem duas vezes no mesmo carrinho.</w:t>
+      </w:r>
+    </w:p>
+    <w:p>
+      <w:pPr>
+        <w:spacing w:line="360" w:lineRule="auto" w:after="0"/>
+        <w:ind w:firstLine="709"/>
+        <w:jc w:val="both"/>
+      </w:pPr>
+      <w:r>
+        <w:t xml:space="preserve">Era </w:t>
+      </w:r>
+      <w:r>
+        <w:rPr>
+          <w:b/>
+        </w:rPr>
+        <w:t>giro</w:t>
+      </w:r>
+      <w:r>
+        <w:t>: comprando todo dia, eu era obrigado a saber quanto eu vendia por dia. No fim da primeira semana eu já sabia dimensionar a compra, e a sobra que eu jogava fora virou quase zero.</w:t>
+      </w:r>
+    </w:p>
+    <w:p>
+      <w:pPr>
+        <w:spacing w:line="360" w:lineRule="auto" w:after="0"/>
+        <w:ind w:firstLine="709"/>
+        <w:jc w:val="both"/>
+      </w:pPr>
+      <w:r>
+        <w:t xml:space="preserve">E era </w:t>
+      </w:r>
+      <w:r>
+        <w:rPr>
+          <w:b/>
+        </w:rPr>
+        <w:t>capital de giro de novo</w:t>
+      </w:r>
+      <w:r>
+        <w:t>: pagando o pão no dia seguinte, eu vendia antes de pagar. O meu fornecedor financiava o meu dia sem cobrar nada por isso, porque eu nunca atrasei.</w:t>
+      </w:r>
+    </w:p>
+    <w:p>
+      <w:pPr>
+        <w:spacing w:line="360" w:lineRule="auto" w:after="0"/>
+        <w:ind w:firstLine="709"/>
+        <w:jc w:val="both"/>
+      </w:pPr>
+      <w:r>
+        <w:t>Um rapaz de vinte e poucos anos, com um carrinho emprestado, estava rodando controle de estoque, gestão de qualidade e ciclo financeiro. Eu não sabia nenhum desses nomes.</w:t>
+      </w:r>
+    </w:p>
+    <w:p>
+      <w:pPr>
+        <w:spacing w:line="360" w:lineRule="auto" w:after="0"/>
+        <w:ind w:firstLine="709"/>
+        <w:jc w:val="both"/>
+      </w:pPr>
+      <w:r>
+        <w:rPr>
+          <w:b/>
+        </w:rPr>
+        <w:t>Primeiro mês:</w:t>
+      </w:r>
+      <w:r>
+        <w:t xml:space="preserve"> foi uma bênção. Pela primeira vez em um ano eu tinha previsão de quanto entraria.</w:t>
+      </w:r>
+    </w:p>
+    <w:p>
+      <w:pPr>
+        <w:spacing w:line="360" w:lineRule="auto" w:after="0"/>
+        <w:ind w:firstLine="709"/>
+        <w:jc w:val="both"/>
+      </w:pPr>
+      <w:r>
+        <w:rPr>
+          <w:b/>
+        </w:rPr>
+        <w:t>Segundo mês:</w:t>
+      </w:r>
+      <w:r>
+        <w:t xml:space="preserve"> consolidei o ponto perto de uns prediozinhos no bairro Floramar. O ponto era estratégico por um motivo que eu não vou esconder: a minha namorada, a Érica, morava ali. Os melhores dias eram os fins de semana, e ela me ajudava no carrinho. Juntei o útil ao agradável, e foi um tempo de muita alegria.</w:t>
+      </w:r>
+    </w:p>
+    <w:p>
+      <w:pPr>
+        <w:spacing w:line="360" w:lineRule="auto" w:after="0"/>
+        <w:ind w:firstLine="709"/>
+        <w:jc w:val="both"/>
+      </w:pPr>
+      <w:r>
+        <w:rPr>
+          <w:b/>
+        </w:rPr>
+        <w:t>Terceiro mês:</w:t>
+      </w:r>
+      <w:r>
+        <w:t xml:space="preserve"> o faturamento tinha dobrado, e a previsão era triplicar até o fim do semestre. Eu já estava programando o noivado e procurando uma casa geminada para financiar.</w:t>
+      </w:r>
+    </w:p>
+    <w:p>
+      <w:pPr>
+        <w:spacing w:line="360" w:lineRule="auto" w:after="0"/>
+        <w:ind w:firstLine="709"/>
+        <w:jc w:val="both"/>
+      </w:pPr>
+      <w:r>
+        <w:t>Pela primeira vez na vida eu me vi empresário.</w:t>
+      </w:r>
+    </w:p>
+    <w:p>
+      <w:pPr>
+        <w:spacing w:line="360" w:lineRule="auto" w:before="360" w:after="120"/>
+      </w:pPr>
+      <w:r>
+        <w:rPr>
+          <w:b/>
+          <w:i/>
+        </w:rPr>
+        <w:t>Cinco dias antes</w:t>
+      </w:r>
+    </w:p>
+    <w:p>
+      <w:pPr>
+        <w:spacing w:line="360" w:lineRule="auto" w:after="0"/>
+        <w:ind w:firstLine="709"/>
+        <w:jc w:val="both"/>
+      </w:pPr>
+      <w:r>
+        <w:t>Faltando cinco dias para o vencimento da primeira parcela, com o dinheiro das duas primeiras já separado, o dono do carrinho me procurou.</w:t>
+      </w:r>
+    </w:p>
+    <w:p>
+      <w:pPr>
+        <w:spacing w:line="360" w:lineRule="auto" w:after="0"/>
+        <w:ind w:firstLine="709"/>
+        <w:jc w:val="both"/>
+      </w:pPr>
+      <w:r>
+        <w:t>Ele precisava do carrinho de volta. A justificativa foi que o ponto dele tinha crescido e ele ia precisar ampliar o atendimento.</w:t>
+      </w:r>
+    </w:p>
+    <w:p>
+      <w:pPr>
+        <w:spacing w:line="360" w:lineRule="auto" w:after="0"/>
+        <w:ind w:firstLine="709"/>
+        <w:jc w:val="both"/>
+      </w:pPr>
+      <w:r>
+        <w:t xml:space="preserve">Não havia nada escrito. Nem recibo, nem contrato, nem testemunha. </w:t>
+      </w:r>
+      <w:r>
+        <w:rPr>
+          <w:b/>
+        </w:rPr>
+        <w:t>A gente tinha fechado de boca</w:t>
+      </w:r>
+      <w:r>
+        <w:t>, e de boca ele desfez.</w:t>
+      </w:r>
+    </w:p>
+    <w:p>
+      <w:pPr>
+        <w:spacing w:line="360" w:lineRule="auto" w:after="0"/>
+        <w:ind w:firstLine="709"/>
+        <w:jc w:val="both"/>
+      </w:pPr>
+      <w:r>
+        <w:t>Eu vi o meu mundo cair naquela tarde. Não era o carrinho. Era o noivado marcado, a casa que eu estava procurando, e a primeira vez em que eu tinha olhado para a minha própria vida e visto um caminho.</w:t>
+      </w:r>
+    </w:p>
+    <w:p>
+      <w:pPr>
+        <w:spacing w:line="360" w:lineRule="auto" w:before="360" w:after="120"/>
+      </w:pPr>
+      <w:r>
+        <w:rPr>
+          <w:b/>
+          <w:i/>
+        </w:rPr>
+        <w:t>O que essa queda me ensinou, e levei vinte anos para aplicar</w:t>
+      </w:r>
+    </w:p>
+    <w:p>
+      <w:pPr>
+        <w:spacing w:line="360" w:lineRule="auto" w:after="0"/>
+        <w:ind w:firstLine="709"/>
+        <w:jc w:val="both"/>
+      </w:pPr>
+      <w:r>
+        <w:rPr>
+          <w:b/>
+        </w:rPr>
+        <w:t>Combinado de boca vale enquanto for conveniente para os dois.</w:t>
+      </w:r>
+      <w:r>
+        <w:t xml:space="preserve"> No dia em que deixa de ser conveniente para um, ele não existe. E repare que não precisa nem haver má-fé: talvez o ponto dele tivesse crescido mesmo. O problema é que, sem documento, a versão dele é a única que vale.</w:t>
+      </w:r>
+    </w:p>
+    <w:p>
+      <w:pPr>
+        <w:spacing w:line="360" w:lineRule="auto" w:after="0"/>
+        <w:ind w:firstLine="709"/>
+        <w:jc w:val="both"/>
+      </w:pPr>
+      <w:r>
+        <w:rPr>
+          <w:b/>
+        </w:rPr>
+        <w:t>O momento do pedido não foi coincidência.</w:t>
+      </w:r>
+      <w:r>
+        <w:t xml:space="preserve"> Três meses é exatamente o tempo que levou para ficar claro que o negócio dava certo. Pedir de volta no primeiro mês seria devolver um carrinho velho a um desempregado. Pedir no terceiro foi retomar um ponto consolidado.</w:t>
+      </w:r>
+    </w:p>
+    <w:p>
+      <w:pPr>
+        <w:spacing w:line="360" w:lineRule="auto" w:after="0"/>
+        <w:ind w:firstLine="709"/>
+        <w:jc w:val="both"/>
+      </w:pPr>
+      <w:r>
+        <w:rPr>
+          <w:b/>
+        </w:rPr>
+        <w:t>E a lição que me persegue:</w:t>
+      </w:r>
+      <w:r>
+        <w:t xml:space="preserve"> a falta de conhecimento, de direção e, principalmente, de documento não me protegeu. Eu tinha capacidade de tocar o negócio, e capacidade não protege ninguém. </w:t>
+      </w:r>
+      <w:r>
+        <w:rPr>
+          <w:b/>
+        </w:rPr>
+        <w:t>Protege papel.</w:t>
+      </w:r>
+    </w:p>
+    <w:p>
+      <w:pPr>
+        <w:spacing w:line="360" w:lineRule="auto" w:after="0" w:before="120"/>
+        <w:ind w:firstLine="0" w:left="1134"/>
+        <w:jc w:val="both"/>
+      </w:pPr>
+      <w:r>
+        <w:rPr>
+          <w:b/>
+          <w:i/>
+        </w:rPr>
+        <w:t>Sacada do Giba</w:t>
+      </w:r>
+    </w:p>
+    <w:p>
+      <w:pPr>
+        <w:spacing w:line="360" w:lineRule="auto" w:after="0" w:before="120"/>
+        <w:ind w:firstLine="0" w:left="1134"/>
+        <w:jc w:val="both"/>
+      </w:pPr>
+      <w:r>
+        <w:rPr>
+          <w:i/>
+        </w:rPr>
+        <w:t>Se você hoje tem um acordo importante que existe só na palavra, faça uma coisa esta semana: mande uma mensagem ao outro escrevendo o que foi combinado e peça que ele confirme. Chame de memória, não de desconfiança. No dia em que a conveniência mudar, essa mensagem vai ser a diferença entre a sua versão e a dele.</w:t>
+      </w:r>
+    </w:p>
+    <w:p>
+      <w:pPr>
+        <w:spacing w:line="360" w:lineRule="auto" w:before="360" w:after="120"/>
+      </w:pPr>
+      <w:r>
+        <w:rPr>
+          <w:b/>
+          <w:i w:val="0"/>
+        </w:rPr>
+        <w:t>A segunda: o chão que não era meu</w:t>
       </w:r>
     </w:p>
     <w:p>
@@ -140,7 +659,7 @@
           <w:b/>
           <w:i w:val="0"/>
         </w:rPr>
-        <w:t>A segunda: o cliente único</w:t>
+        <w:t>A terceira: o cliente único</w:t>
       </w:r>
     </w:p>
     <w:p>
@@ -198,7 +717,7 @@
           <w:b/>
           <w:i w:val="0"/>
         </w:rPr>
-        <w:t>A terceira: a minha cara, terceirizada</w:t>
+        <w:t>A quarta: a minha cara, terceirizada</w:t>
       </w:r>
     </w:p>
     <w:p>
@@ -246,7 +765,7 @@
           <w:b/>
           <w:i w:val="0"/>
         </w:rPr>
-        <w:t>A quarta: o contrato que eu não li</w:t>
+        <w:t>A quinta: o contrato que eu não li</w:t>
       </w:r>
     </w:p>
     <w:p>
@@ -256,7 +775,7 @@
         <w:jc w:val="both"/>
       </w:pPr>
       <w:r>
-        <w:t>Essa é a mais longa, é a mais recente, e é a única cuja moral não é operacional. É jurídica. Por isso ela merece o espaço que as outras não tiveram.</w:t>
+        <w:t>Essa é a mais longa e a mais recente. A moral dela é a mesma da primeira, vinte anos depois, e é por isso que eu as coloquei nas duas pontas deste capítulo. Por isso ela merece o espaço que as outras não tiveram.</w:t>
       </w:r>
     </w:p>
     <w:p>
@@ -1105,7 +1624,7 @@
           <w:b/>
           <w:i w:val="0"/>
         </w:rPr>
-        <w:t>O que as quatro têm em comum</w:t>
+        <w:t>O que as cinco têm em comum</w:t>
       </w:r>
     </w:p>
     <w:p>
@@ -1189,7 +1708,57 @@
               <w:rPr>
                 <w:sz w:val="22"/>
               </w:rPr>
-              <w:t>Super Boy</w:t>
+              <w:t>Carrinho</w:t>
+            </w:r>
+          </w:p>
+        </w:tc>
+        <w:tc>
+          <w:tcPr>
+            <w:tcW w:type="dxa" w:w="3135"/>
+          </w:tcPr>
+          <w:p>
+            <w:pPr>
+              <w:spacing w:line="240" w:lineRule="auto" w:after="0"/>
+            </w:pPr>
+            <w:r>
+              <w:rPr>
+                <w:sz w:val="22"/>
+              </w:rPr>
+              <w:t>do dono do carrinho, sem nada escrito</w:t>
+            </w:r>
+          </w:p>
+        </w:tc>
+        <w:tc>
+          <w:tcPr>
+            <w:tcW w:type="dxa" w:w="3135"/>
+          </w:tcPr>
+          <w:p>
+            <w:pPr>
+              <w:spacing w:line="240" w:lineRule="auto" w:after="0"/>
+            </w:pPr>
+            <w:r>
+              <w:rPr>
+                <w:sz w:val="22"/>
+              </w:rPr>
+              <w:t>não</w:t>
+            </w:r>
+          </w:p>
+        </w:tc>
+      </w:tr>
+      <w:tr>
+        <w:tc>
+          <w:tcPr>
+            <w:tcW w:type="dxa" w:w="3135"/>
+          </w:tcPr>
+          <w:p>
+            <w:pPr>
+              <w:spacing w:line="240" w:lineRule="auto" w:after="0"/>
+            </w:pPr>
+            <w:r>
+              <w:rPr>
+                <w:sz w:val="22"/>
+              </w:rPr>
+              <w:t>Expresso</w:t>
             </w:r>
           </w:p>
         </w:tc>
@@ -1389,7 +1958,7 @@
         <w:jc w:val="both"/>
       </w:pPr>
       <w:r>
-        <w:t xml:space="preserve">Quatro negócios, quatro décadas diferentes da minha vida, quatro tamanhos diferentes. </w:t>
+        <w:t xml:space="preserve">Cinco negócios, décadas diferentes da minha vida, tamanhos diferentes. </w:t>
       </w:r>
       <w:r>
         <w:rPr>
@@ -1405,7 +1974,7 @@
         <w:jc w:val="both"/>
       </w:pPr>
       <w:r>
-        <w:t>E nas quatro o negócio estava indo bem no dia anterior.</w:t>
+        <w:t>E nas cinco o negócio estava indo bem no dia anterior.</w:t>
       </w:r>
     </w:p>
     <w:p>
@@ -1415,7 +1984,26 @@
         <w:jc w:val="both"/>
       </w:pPr>
       <w:r>
-        <w:t xml:space="preserve">Demorei três para enxergar o padrão e quatro para transformá-lo em regra. É a regra que eu uso até hoje, e é a que explica, neste livro, por que eu não entrei na empresa do meu amigo: </w:t>
+        <w:t xml:space="preserve">Repare numa coisa que só ficou clara para mim escrevendo este capítulo. A primeira e a última têm a mesma moral: </w:t>
+      </w:r>
+      <w:r>
+        <w:rPr>
+          <w:b/>
+        </w:rPr>
+        <w:t>combinado que não está escrito não existe, e contrato que você não leu é um combinado de boca com mais páginas.</w:t>
+      </w:r>
+      <w:r>
+        <w:t xml:space="preserve"> Entre uma e outra passaram vinte anos, e eu paguei duas vezes pela mesma aula.</w:t>
+      </w:r>
+    </w:p>
+    <w:p>
+      <w:pPr>
+        <w:spacing w:line="360" w:lineRule="auto" w:after="0"/>
+        <w:ind w:firstLine="709"/>
+        <w:jc w:val="both"/>
+      </w:pPr>
+      <w:r>
+        <w:t xml:space="preserve">Demorei três quedas para enxergar o padrão e cinco para transformá-lo em regra. É a regra que eu uso até hoje, e é a que explica, neste livro, por que eu não entrei na empresa do meu amigo: </w:t>
       </w:r>
       <w:r>
         <w:rPr>
@@ -1691,7 +2279,7 @@
         <w:jc w:val="both"/>
       </w:pPr>
       <w:r>
-        <w:t>Eu disse sete e contei quatro.</w:t>
+        <w:t>Eu disse sete e contei cinco.</w:t>
       </w:r>
     </w:p>
     <w:p>
@@ -1710,7 +2298,7 @@
         <w:rPr>
           <w:i/>
         </w:rPr>
-        <w:t>As outras três quedas. O Gilberto ainda não as contou. Se alguma delas envolver pessoa viva e identificável, vale decidir junto se entra, como entrou esta, sem nome.</w:t>
+        <w:t>As outras duas quedas. O Gilberto ainda não as contou. Se envolverem pessoa viva e identificável, vale decidir junto se entram, como entraram estas, sem nome.</w:t>
       </w:r>
     </w:p>
     <w:sectPr>

</xml_diff>

<commit_message>
Livro: o epilogo do carrinho, e a ordem das quedas resolvida
O rapaz do bairro que mais tarde lhe alugaria a primeira moto o procurou
para dizer que o novo dono servia molho requentado e pao dormido. Foi assim
que ele entendeu que o que queriam era o ponto, e que ponto sem qualidade e
sem compromisso nao se sustenta.

Isso tambem resolve a cronologia: o carrinho veio antes do expresso de
motoboy, que era a duvida que estava em aberto.

A leitura que eu acrescentei: eu perdi o negocio, ele destruiu o negocio.

Capitulo em 11 paginas. Parcial: 61 das 100.

Co-Authored-By: Claude Opus 5 <noreply@anthropic.com>
</commit_message>
<xml_diff>
--- a/livro-o-medico-e-o-executivo/formatado/as-sete-quedas.docx
+++ b/livro-o-medico-e-o-executivo/formatado/as-sete-quedas.docx
@@ -508,6 +508,140 @@
           <w:b/>
           <w:i/>
         </w:rPr>
+        <w:t>O que eu descobri depois, e que explica tudo</w:t>
+      </w:r>
+    </w:p>
+    <w:p>
+      <w:pPr>
+        <w:spacing w:line="360" w:lineRule="auto" w:after="0"/>
+        <w:ind w:firstLine="709"/>
+        <w:jc w:val="both"/>
+      </w:pPr>
+      <w:r>
+        <w:t>Algum tempo depois, já na fase seguinte da minha vida, encontrei um rapaz do bairro, o mesmo que mais tarde me alugaria a minha primeira moto. Ele me olhou e perguntou:</w:t>
+      </w:r>
+    </w:p>
+    <w:p>
+      <w:pPr>
+        <w:spacing w:line="360" w:lineRule="auto" w:after="0"/>
+        <w:ind w:firstLine="709"/>
+        <w:jc w:val="both"/>
+      </w:pPr>
+      <w:r>
+        <w:rPr>
+          <w:b/>
+        </w:rPr>
+        <w:t>Por que você largou o carrinho? O seu sanduíche era o melhor de todos. Agora o cara que está lá tem molho requentado, pão dormido. É uma porcaria o sanduíche dele.</w:t>
+      </w:r>
+    </w:p>
+    <w:p>
+      <w:pPr>
+        <w:spacing w:line="360" w:lineRule="auto" w:after="0"/>
+        <w:ind w:firstLine="709"/>
+        <w:jc w:val="both"/>
+      </w:pPr>
+      <w:r>
+        <w:t>Eu fiquei um tempo com aquilo na cabeça, e foi assim que eu entendi o que tinha acontecido de verdade.</w:t>
+      </w:r>
+    </w:p>
+    <w:p>
+      <w:pPr>
+        <w:spacing w:line="360" w:lineRule="auto" w:after="0"/>
+        <w:ind w:firstLine="709"/>
+        <w:jc w:val="both"/>
+      </w:pPr>
+      <w:r>
+        <w:rPr>
+          <w:b/>
+        </w:rPr>
+        <w:t>O que ele queria não era o carrinho. Era o meu ponto.</w:t>
+      </w:r>
+    </w:p>
+    <w:p>
+      <w:pPr>
+        <w:spacing w:line="360" w:lineRule="auto" w:after="0"/>
+        <w:ind w:firstLine="709"/>
+        <w:jc w:val="both"/>
+      </w:pPr>
+      <w:r>
+        <w:t>Faz todo o sentido. O carrinho era velho, ele já tinha comprado um novo. O que tinha virado valioso naqueles três meses não era o equipamento, era a clientela formada em frente àqueles prédios, no horário certo, com fila nos fins de semana.</w:t>
+      </w:r>
+    </w:p>
+    <w:p>
+      <w:pPr>
+        <w:spacing w:line="360" w:lineRule="auto" w:after="0"/>
+        <w:ind w:firstLine="709"/>
+        <w:jc w:val="both"/>
+      </w:pPr>
+      <w:r>
+        <w:t>Só que ele levou o carrinho e o lugar, e não conseguiu levar o negócio.</w:t>
+      </w:r>
+    </w:p>
+    <w:p>
+      <w:pPr>
+        <w:spacing w:line="360" w:lineRule="auto" w:after="0"/>
+        <w:ind w:firstLine="709"/>
+        <w:jc w:val="both"/>
+      </w:pPr>
+      <w:r>
+        <w:t xml:space="preserve">Porque o que fazia aquele ponto valer não estava no carrinho. Estava no molho feito de manhã, no pão comprado naquele dia, na pessoa que lembrava como cada freguês gostava do dele. </w:t>
+      </w:r>
+      <w:r>
+        <w:rPr>
+          <w:b/>
+        </w:rPr>
+        <w:t>Ponto sem qualidade e sem compromisso não se sustenta por muito tempo</w:t>
+      </w:r>
+      <w:r>
+        <w:t>, e em poucos meses o melhor sanduíche do bairro tinha virado uma porcaria.</w:t>
+      </w:r>
+    </w:p>
+    <w:p>
+      <w:pPr>
+        <w:spacing w:line="360" w:lineRule="auto" w:after="0"/>
+        <w:ind w:firstLine="709"/>
+        <w:jc w:val="both"/>
+      </w:pPr>
+      <w:r>
+        <w:t>Eu perdi o negócio. Ele destruiu o negócio. São coisas diferentes, e a segunda é pior.</w:t>
+      </w:r>
+    </w:p>
+    <w:p>
+      <w:pPr>
+        <w:spacing w:line="360" w:lineRule="auto" w:after="0" w:before="120"/>
+        <w:ind w:firstLine="0" w:left="1134"/>
+        <w:jc w:val="both"/>
+      </w:pPr>
+      <w:r>
+        <w:rPr>
+          <w:b/>
+          <w:i/>
+        </w:rPr>
+        <w:t>Sacada do Giba</w:t>
+      </w:r>
+    </w:p>
+    <w:p>
+      <w:pPr>
+        <w:spacing w:line="360" w:lineRule="auto" w:after="0" w:before="120"/>
+        <w:ind w:firstLine="0" w:left="1134"/>
+        <w:jc w:val="both"/>
+      </w:pPr>
+      <w:r>
+        <w:rPr>
+          <w:i/>
+        </w:rPr>
+        <w:t>O que você acha que é o seu ativo quase nunca é. Pergunte o que exatamente faz o cliente voltar: se a resposta for alguma coisa que se carrega num caminhão, qualquer um te copia amanhã. Se a resposta for o jeito como a coisa é feita todo dia, você tem um negócio, e ele não cabe na mala de ninguém.</w:t>
+      </w:r>
+    </w:p>
+    <w:p>
+      <w:pPr>
+        <w:spacing w:line="360" w:lineRule="auto" w:before="360" w:after="120"/>
+      </w:pPr>
+      <w:r>
+        <w:rPr>
+          <w:b/>
+          <w:i/>
+        </w:rPr>
         <w:t>O que essa queda me ensinou, e levei vinte anos para aplicar</w:t>
       </w:r>
     </w:p>
@@ -540,7 +674,7 @@
         <w:t>O momento do pedido não foi coincidência.</w:t>
       </w:r>
       <w:r>
-        <w:t xml:space="preserve"> Três meses é exatamente o tempo que levou para ficar claro que o negócio dava certo. Pedir de volta no primeiro mês seria devolver um carrinho velho a um desempregado. Pedir no terceiro foi retomar um ponto consolidado.</w:t>
+        <w:t xml:space="preserve"> Três meses é exatamente o tempo que levou para ficar claro que o negócio dava certo. Pedir de volta no primeiro mês seria devolver um carrinho velho a um desempregado. Pedir no terceiro foi retomar um ponto consolidado. E repare na ironia: ele acertou a hora e errou o que estava comprando.</w:t>
       </w:r>
     </w:p>
     <w:p>

</xml_diff>

<commit_message>
Livro: a demissao da Fiat fecha o arco de Dois caminhos
Ele financiou um carro no proprio nome para o amigo que lhe dera a carta de
recomendacao da Fiat. O amigo parou de pagar, e a fabrica, que exigia
conduta ilibada inclusive fora dali, o desligou para quitar a divida com o
banco do grupo. Estava com dois anos de casa e a caminho da promocao a
piloto de teste.

Botei no capitulo da Fiat, e nao no das quedas, porque a simetria so
funciona junta: a promocao veio de uma reputacao construida sem ele
perceber, e a demissao veio de uma reputacao destruida sem ele perceber.

No capitulo das quedas ela entra como a que vem antes de todas, em
referencia curta, e as secoes passaram a ser nomeadas pelo negocio em vez
de numeradas.

A montadora aparece sem nome no trecho da demissao. Esta sinalizado nas
notas como passagem para passar por advogado.

Parcial: 70 das 100 paginas. Caderno com 71.

Co-Authored-By: Claude Opus 5 <noreply@anthropic.com>
</commit_message>
<xml_diff>
--- a/livro-o-medico-e-o-executivo/formatado/as-sete-quedas.docx
+++ b/livro-o-medico-e-o-executivo/formatado/as-sete-quedas.docx
@@ -82,7 +82,7 @@
           <w:b/>
           <w:i w:val="0"/>
         </w:rPr>
-        <w:t>O carrinho: a primeira, e a que mais doeu</w:t>
+        <w:t>A que vem antes de todas: o nome emprestado</w:t>
       </w:r>
     </w:p>
     <w:p>
@@ -92,7 +92,74 @@
         <w:jc w:val="both"/>
       </w:pPr>
       <w:r>
-        <w:t>Eu começo por esta porque foi a primeira vez que eu perdi um negócio, e porque, de todas as sete, foi a que me machucou mais. As outras me custaram dinheiro. Esta me custou um projeto de vida.</w:t>
+        <w:t>A primeira vez que eu perdi tudo não foi num negócio meu. Foi num emprego, e por uma dívida que não era minha.</w:t>
+      </w:r>
+    </w:p>
+    <w:p>
+      <w:pPr>
+        <w:spacing w:line="360" w:lineRule="auto" w:after="0"/>
+        <w:ind w:firstLine="709"/>
+        <w:jc w:val="both"/>
+      </w:pPr>
+      <w:r>
+        <w:t>Eu financiei um carro no meu nome para um amigo. Ele parou de pagar, e a montadora onde eu trabalhava, que exigia conduta ilibada inclusive fora da fábrica, me desligou para quitar a dívida com o banco do próprio grupo. Eu estava fazendo dois anos de casa e a caminho de uma promoção que era o sonho de todo mundo ali.</w:t>
+      </w:r>
+    </w:p>
+    <w:p>
+      <w:pPr>
+        <w:spacing w:line="360" w:lineRule="auto" w:after="0"/>
+        <w:ind w:firstLine="709"/>
+        <w:jc w:val="both"/>
+      </w:pPr>
+      <w:r>
+        <w:t xml:space="preserve">Essa história está contada inteira no capítulo de abertura, porque ela fecha o arco daquela fábrica. Eu a trago aqui porque ela é a primeira da série, e porque a lição dela já é a lição de todas as outras: </w:t>
+      </w:r>
+      <w:r>
+        <w:rPr>
+          <w:b/>
+        </w:rPr>
+        <w:t>o nome no papel é o que vale, não o combinado entre pessoas de bem.</w:t>
+      </w:r>
+    </w:p>
+    <w:p>
+      <w:pPr>
+        <w:spacing w:line="360" w:lineRule="auto" w:after="0"/>
+        <w:ind w:firstLine="709"/>
+        <w:jc w:val="both"/>
+      </w:pPr>
+      <w:r>
+        <w:t>Dela saiu o ano de desemprego que levou ao carrinho.</w:t>
+      </w:r>
+    </w:p>
+    <w:p>
+      <w:pPr>
+        <w:spacing w:line="360" w:lineRule="auto" w:before="360" w:after="120"/>
+      </w:pPr>
+      <w:r>
+        <w:rPr>
+          <w:b/>
+          <w:i w:val="0"/>
+        </w:rPr>
+        <w:t>O carrinho: a primeira empresa, e a que mais doeu</w:t>
+      </w:r>
+    </w:p>
+    <w:p>
+      <w:pPr>
+        <w:spacing w:line="360" w:lineRule="auto" w:after="0"/>
+        <w:ind w:firstLine="709"/>
+        <w:jc w:val="both"/>
+      </w:pPr>
+      <w:r>
+        <w:t xml:space="preserve">Eu começo esta porque foi a primeira vez que eu perdi um negócio </w:t>
+      </w:r>
+      <w:r>
+        <w:rPr>
+          <w:b/>
+        </w:rPr>
+        <w:t>meu</w:t>
+      </w:r>
+      <w:r>
+        <w:t>, e porque, de todas as sete, foi a que me machucou mais. As outras me custaram dinheiro. Esta me custou um projeto de vida.</w:t>
       </w:r>
     </w:p>
     <w:p>
@@ -735,7 +802,7 @@
           <w:b/>
           <w:i w:val="0"/>
         </w:rPr>
-        <w:t>A segunda: o chão que não era meu</w:t>
+        <w:t>O expresso: o chão que não era meu</w:t>
       </w:r>
     </w:p>
     <w:p>
@@ -793,7 +860,7 @@
           <w:b/>
           <w:i w:val="0"/>
         </w:rPr>
-        <w:t>A terceira: o cliente único</w:t>
+        <w:t>A PrestConsult: o cliente único</w:t>
       </w:r>
     </w:p>
     <w:p>
@@ -851,7 +918,7 @@
           <w:b/>
           <w:i w:val="0"/>
         </w:rPr>
-        <w:t>A quarta: a minha cara, terceirizada</w:t>
+        <w:t>O PABX: a minha cara, terceirizada</w:t>
       </w:r>
     </w:p>
     <w:p>
@@ -899,7 +966,7 @@
           <w:b/>
           <w:i w:val="0"/>
         </w:rPr>
-        <w:t>A quinta: o contrato que eu não li</w:t>
+        <w:t>A academia: o contrato que eu não li</w:t>
       </w:r>
     </w:p>
     <w:p>
@@ -1758,7 +1825,7 @@
           <w:b/>
           <w:i w:val="0"/>
         </w:rPr>
-        <w:t>O que as cinco têm em comum</w:t>
+        <w:t>O que elas têm em comum</w:t>
       </w:r>
     </w:p>
     <w:p>
@@ -1807,7 +1874,7 @@
                 <w:b/>
                 <w:sz w:val="22"/>
               </w:rPr>
-              <w:t>O negócio dependia de</w:t>
+              <w:t>Dependia de</w:t>
             </w:r>
           </w:p>
         </w:tc>
@@ -1825,6 +1892,56 @@
                 <w:sz w:val="22"/>
               </w:rPr>
               <w:t>Eu controlava?</w:t>
+            </w:r>
+          </w:p>
+        </w:tc>
+      </w:tr>
+      <w:tr>
+        <w:tc>
+          <w:tcPr>
+            <w:tcW w:type="dxa" w:w="3135"/>
+          </w:tcPr>
+          <w:p>
+            <w:pPr>
+              <w:spacing w:line="240" w:lineRule="auto" w:after="0"/>
+            </w:pPr>
+            <w:r>
+              <w:rPr>
+                <w:sz w:val="22"/>
+              </w:rPr>
+              <w:t>Fiat</w:t>
+            </w:r>
+          </w:p>
+        </w:tc>
+        <w:tc>
+          <w:tcPr>
+            <w:tcW w:type="dxa" w:w="3135"/>
+          </w:tcPr>
+          <w:p>
+            <w:pPr>
+              <w:spacing w:line="240" w:lineRule="auto" w:after="0"/>
+            </w:pPr>
+            <w:r>
+              <w:rPr>
+                <w:sz w:val="22"/>
+              </w:rPr>
+              <w:t>de um amigo pagar o que estava no meu nome</w:t>
+            </w:r>
+          </w:p>
+        </w:tc>
+        <w:tc>
+          <w:tcPr>
+            <w:tcW w:type="dxa" w:w="3135"/>
+          </w:tcPr>
+          <w:p>
+            <w:pPr>
+              <w:spacing w:line="240" w:lineRule="auto" w:after="0"/>
+            </w:pPr>
+            <w:r>
+              <w:rPr>
+                <w:sz w:val="22"/>
+              </w:rPr>
+              <w:t>não</w:t>
             </w:r>
           </w:p>
         </w:tc>
@@ -2092,7 +2209,7 @@
         <w:jc w:val="both"/>
       </w:pPr>
       <w:r>
-        <w:t xml:space="preserve">Cinco negócios, décadas diferentes da minha vida, tamanhos diferentes. </w:t>
+        <w:t xml:space="preserve">Seis situações, décadas diferentes da minha vida, tamanhos diferentes. </w:t>
       </w:r>
       <w:r>
         <w:rPr>
@@ -2108,7 +2225,7 @@
         <w:jc w:val="both"/>
       </w:pPr>
       <w:r>
-        <w:t>E nas cinco o negócio estava indo bem no dia anterior.</w:t>
+        <w:t>E em todas elas estava tudo bem no dia anterior.</w:t>
       </w:r>
     </w:p>
     <w:p>
@@ -2137,7 +2254,7 @@
         <w:jc w:val="both"/>
       </w:pPr>
       <w:r>
-        <w:t xml:space="preserve">Demorei três quedas para enxergar o padrão e cinco para transformá-lo em regra. É a regra que eu uso até hoje, e é a que explica, neste livro, por que eu não entrei na empresa do meu amigo: </w:t>
+        <w:t xml:space="preserve">Demorei três quedas para enxergar o padrão e seis para transformá-lo em regra. É a regra que eu uso até hoje, e é a que explica, neste livro, por que eu não entrei na empresa do meu amigo: </w:t>
       </w:r>
       <w:r>
         <w:rPr>
@@ -2413,7 +2530,7 @@
         <w:jc w:val="both"/>
       </w:pPr>
       <w:r>
-        <w:t>Eu disse sete e contei cinco.</w:t>
+        <w:t>Eu disse sete e contei seis.</w:t>
       </w:r>
     </w:p>
     <w:p>
@@ -2432,7 +2549,7 @@
         <w:rPr>
           <w:i/>
         </w:rPr>
-        <w:t>As outras duas quedas. O Gilberto ainda não as contou. Se envolverem pessoa viva e identificável, vale decidir junto se entram, como entraram estas, sem nome.</w:t>
+        <w:t>A sétima queda. O Gilberto ainda não as contou. Se envolverem pessoa viva e identificável, vale decidir junto se entram, como entraram estas, sem nome.</w:t>
       </w:r>
     </w:p>
     <w:sectPr>

</xml_diff>